<commit_message>
Audit small business AI content article: add AI search section, keyword research step, replace overlapping FAQs, new verified sources
Co-Authored-By: Claude Opus 5.5 <noreply@anthropic.com>
Claude-Session: https://claude.ai/code/session_01GQXcnZLn4f9MkUS7SEqp5J
</commit_message>
<xml_diff>
--- a/blog-content/AI-Content-Writing-for-Small-Business.docx
+++ b/blog-content/AI-Content-Writing-for-Small-Business.docx
@@ -962,7 +962,7 @@
         </w:rPr>
         <w:t xml:space="preserve"> the Office for National Statistics found </w:t>
       </w:r>
-      <w:hyperlink w:history="1" r:id="rId9oogkyv6azplo-7oqjugl">
+      <w:hyperlink w:history="1" r:id="rId0sof0krflo0yexrk5v8w_">
         <w:r>
           <w:rPr>
             <w:rStyle w:val="Hyperlink"/>
@@ -1013,7 +1013,7 @@
         </w:rPr>
         <w:t xml:space="preserve"> the British Chambers of Commerce reported in March 2026 that </w:t>
       </w:r>
-      <w:hyperlink w:history="1" r:id="rIdzebbp_ljny0zresk3o2sc">
+      <w:hyperlink w:history="1" r:id="rIdhkawtrqnzyk8bck-uqbvd">
         <w:r>
           <w:rPr>
             <w:rStyle w:val="Hyperlink"/>
@@ -1064,7 +1064,7 @@
         </w:rPr>
         <w:t xml:space="preserve"> the U.S. Chamber of Commerce found </w:t>
       </w:r>
-      <w:hyperlink w:history="1" r:id="rIdhh208z4ry1k9ojfbdwkcw">
+      <w:hyperlink w:history="1" r:id="rIdkvibrivgnom-wxhlm7sf8">
         <w:r>
           <w:rPr>
             <w:rStyle w:val="Hyperlink"/>
@@ -1114,7 +1114,7 @@
         </w:rPr>
         <w:t xml:space="preserve">There's also a warning in the marketing data. HubSpot's </w:t>
       </w:r>
-      <w:hyperlink w:history="1" r:id="rIdiwtwi6nj-00l4bseflso6">
+      <w:hyperlink w:history="1" r:id="rId_oi6begv1jjbozxyqliyc">
         <w:r>
           <w:rPr>
             <w:rStyle w:val="Hyperlink"/>
@@ -1206,7 +1206,7 @@
         </w:rPr>
         <w:t xml:space="preserve">The fairest comparison is with hiring a writer. The 2026 ProCopywriters survey of 383 UK freelance copywriters puts the </w:t>
       </w:r>
-      <w:hyperlink w:history="1" r:id="rIdzcsarxvgtvgiqfcsd8ppa">
+      <w:hyperlink w:history="1" r:id="rId-ah3flyki5_j1l2zzb6x8">
         <w:r>
           <w:rPr>
             <w:rStyle w:val="Hyperlink"/>
@@ -1389,7 +1389,7 @@
         </w:rPr>
         <w:t xml:space="preserve"> my first choice for writing. It follows long, detailed instructions consistently, which matters when you want every draft to sound like your business. I compare it with the alternatives in </w:t>
       </w:r>
-      <w:hyperlink w:history="1" r:id="rIdanewvq8vz0esq36er-krs">
+      <w:hyperlink w:history="1" r:id="rIduwi4wi4q55h-ti7tbiyr4">
         <w:r>
           <w:rPr>
             <w:rStyle w:val="Hyperlink"/>
@@ -1469,7 +1469,7 @@
         </w:rPr>
         <w:t xml:space="preserve"> its built-in assistant, </w:t>
       </w:r>
-      <w:hyperlink w:history="1" r:id="rIdf3mmdcfy7bfqyln73fkst">
+      <w:hyperlink w:history="1" r:id="rIdg9i2sokvtsdo2_ici0ymn">
         <w:r>
           <w:rPr>
             <w:rStyle w:val="Hyperlink"/>
@@ -1520,7 +1520,7 @@
         </w:rPr>
         <w:t xml:space="preserve"> the </w:t>
       </w:r>
-      <w:hyperlink w:history="1" r:id="rIdhqfinsdbxa9jblfu3ugtd">
+      <w:hyperlink w:history="1" r:id="rIdep_fz_f6ya2t0qojoclj2">
         <w:r>
           <w:rPr>
             <w:rStyle w:val="Hyperlink"/>
@@ -1540,7 +1540,7 @@
           <w:sz w:val="24"/>
           <w:szCs w:val="24"/>
         </w:rPr>
-        <w:t xml:space="preserve"> drafts blog posts and landing pages from your business context. It's part of Content Hub's paid tiers, so it suits businesses already using HubSpot.</w:t>
+        <w:t xml:space="preserve"> drafts blog posts and landing pages from your business context. It's included in Content Hub Professional and Enterprise, so it suits businesses already paying for HubSpot.</w:t>
       </w:r>
     </w:p>
     <w:p>
@@ -1746,7 +1746,7 @@
         </w:rPr>
         <w:t xml:space="preserve">This is the single change that improved my drafts most. According to Anthropic's help centre, </w:t>
       </w:r>
-      <w:hyperlink w:history="1" r:id="rIdy78xvuspqgo0w4gwzarje">
+      <w:hyperlink w:history="1" r:id="rIdw8mhfn0pxcg6mpspukavu">
         <w:r>
           <w:rPr>
             <w:rStyle w:val="Hyperlink"/>
@@ -1874,7 +1874,7 @@
         </w:rPr>
         <w:t xml:space="preserve">On paid plans you can go a step further with </w:t>
       </w:r>
-      <w:hyperlink w:history="1" r:id="rId9leoxk7jnau8_nyv7dokr">
+      <w:hyperlink w:history="1" r:id="rIdmuvctcx4i1wdujj1lk9cp">
         <w:r>
           <w:rPr>
             <w:rStyle w:val="Hyperlink"/>
@@ -2027,7 +2027,7 @@
           <w:sz w:val="24"/>
           <w:szCs w:val="24"/>
         </w:rPr>
-        <w:t xml:space="preserve">Write a one-page business brief: services, prices, service area, ideal customers, tone and the questions customers ask most. Load it into a Claude Project. List 20 real customer questions from emails, calls and reviews; these become your first blog posts and FAQs. Check that your Google Business Profile details are correct.</w:t>
+        <w:t xml:space="preserve">Write a one-page business brief: services, prices, service area, ideal customers, tone and the questions customers ask most. Load it into a Claude Project. List 20 real customer questions from emails, calls and reviews; these become your first blog posts and FAQs. Type a few into Google and note the "People also ask" questions and autocomplete suggestions: they show how customers phrase the same problem. Check that your Google Business Profile details are correct.</w:t>
       </w:r>
     </w:p>
     <w:p>
@@ -2059,7 +2059,7 @@
         </w:rPr>
         <w:t xml:space="preserve">Aim for one blog post a week answering one of those questions, two Google Business Profile posts a week and one email every fortnight. Turn each blog post into three social captions. Before publishing any blog post, write a clear title and check it's under 60 characters; my guide to </w:t>
       </w:r>
-      <w:hyperlink w:history="1" r:id="rIdmnq6dp4seagzf1oltn3zz">
+      <w:hyperlink w:history="1" r:id="rIdes9m2lvdcczoxb0ikkx59">
         <w:r>
           <w:rPr>
             <w:rStyle w:val="Hyperlink"/>
@@ -2081,7 +2081,7 @@
         </w:rPr>
         <w:t xml:space="preserve"> covers how. For the drafting process itself, follow the </w:t>
       </w:r>
-      <w:hyperlink w:history="1" r:id="rIdb5kv0-jwce8idcwtcnr1l">
+      <w:hyperlink w:history="1" r:id="rIdau0dcfkfe_cnz_5qvp9qs">
         <w:r>
           <w:rPr>
             <w:rStyle w:val="Hyperlink"/>
@@ -2148,21 +2148,57 @@
           <w:sz w:val="36"/>
           <w:szCs w:val="36"/>
         </w:rPr>
-        <w:t xml:space="preserve">What are the risks of AI content for a small business?</w:t>
-      </w:r>
-    </w:p>
-    <w:p>
-      <w:pPr>
-        <w:spacing w:after="160"/>
-      </w:pPr>
-      <w:r>
-        <w:rPr>
-          <w:rFonts w:ascii="Calibri" w:cs="Calibri" w:eastAsia="Calibri" w:hAnsi="Calibri"/>
-          <w:color w:val="333333"/>
-          <w:sz w:val="24"/>
-          <w:szCs w:val="24"/>
-        </w:rPr>
-        <w:t xml:space="preserve">The main risks are wrong facts, content that sounds like everyone else, and publishing more than you can check. All three are managed by keeping a person in the loop, not by avoiding AI.</w:t>
+        <w:t xml:space="preserve">How can a small business show up in AI search answers?</w:t>
+      </w:r>
+    </w:p>
+    <w:p>
+      <w:pPr>
+        <w:spacing w:after="160"/>
+      </w:pPr>
+      <w:r>
+        <w:rPr>
+          <w:rFonts w:ascii="Calibri" w:cs="Calibri" w:eastAsia="Calibri" w:hAnsi="Calibri"/>
+          <w:color w:val="333333"/>
+          <w:sz w:val="24"/>
+          <w:szCs w:val="24"/>
+        </w:rPr>
+        <w:t xml:space="preserve">Get your basics right in normal Google Search first. Google says its AI Overviews and AI Mode have </w:t>
+      </w:r>
+      <w:hyperlink w:history="1" r:id="rIdhm73fof_mxsn2nndj6cyv">
+        <w:r>
+          <w:rPr>
+            <w:rStyle w:val="Hyperlink"/>
+            <w:rFonts w:ascii="Calibri" w:cs="Calibri" w:eastAsia="Calibri" w:hAnsi="Calibri"/>
+            <w:color w:val="0563C1"/>
+            <w:sz w:val="24"/>
+            <w:szCs w:val="24"/>
+            <w:u w:val="single"/>
+          </w:rPr>
+          <w:t xml:space="preserve">no extra requirements</w:t>
+        </w:r>
+      </w:hyperlink>
+      <w:r>
+        <w:rPr>
+          <w:rFonts w:ascii="Calibri" w:cs="Calibri" w:eastAsia="Calibri" w:hAnsi="Calibri"/>
+          <w:color w:val="333333"/>
+          <w:sz w:val="24"/>
+          <w:szCs w:val="24"/>
+        </w:rPr>
+        <w:t xml:space="preserve">: a page only needs to be indexed and eligible to show a snippet. The same guidance lists keeping your Business Profile information up to date as a best practice.</w:t>
+      </w:r>
+    </w:p>
+    <w:p>
+      <w:pPr>
+        <w:spacing w:after="160"/>
+      </w:pPr>
+      <w:r>
+        <w:rPr>
+          <w:rFonts w:ascii="Calibri" w:cs="Calibri" w:eastAsia="Calibri" w:hAnsi="Calibri"/>
+          <w:color w:val="333333"/>
+          <w:sz w:val="24"/>
+          <w:szCs w:val="24"/>
+        </w:rPr>
+        <w:t xml:space="preserve">For a small business, that turns into three habits:</w:t>
       </w:r>
     </w:p>
     <w:p>
@@ -2182,16 +2218,16 @@
           <w:sz w:val="24"/>
           <w:szCs w:val="24"/>
         </w:rPr>
-        <w:t xml:space="preserve">Wrong facts.</w:t>
-      </w:r>
-      <w:r>
-        <w:rPr>
-          <w:rFonts w:ascii="Calibri" w:cs="Calibri" w:eastAsia="Calibri" w:hAnsi="Calibri"/>
-          <w:color w:val="333333"/>
-          <w:sz w:val="24"/>
-          <w:szCs w:val="24"/>
-        </w:rPr>
-        <w:t xml:space="preserve"> AI will confidently state an opening time or a statistic that isn't true. Instruct it to use only your files, and check every number before publishing.</w:t>
+        <w:t xml:space="preserve">Answer one question per page or post, in its first sentence.</w:t>
+      </w:r>
+      <w:r>
+        <w:rPr>
+          <w:rFonts w:ascii="Calibri" w:cs="Calibri" w:eastAsia="Calibri" w:hAnsi="Calibri"/>
+          <w:color w:val="333333"/>
+          <w:sz w:val="24"/>
+          <w:szCs w:val="24"/>
+        </w:rPr>
+        <w:t xml:space="preserve"> AI answers quote clear, self-contained answers. The customer questions from your 90-day plan are exactly what people type into ChatGPT and Google.</w:t>
       </w:r>
     </w:p>
     <w:p>
@@ -2211,6 +2247,138 @@
           <w:sz w:val="24"/>
           <w:szCs w:val="24"/>
         </w:rPr>
+        <w:t xml:space="preserve">Keep facts identical everywhere.</w:t>
+      </w:r>
+      <w:r>
+        <w:rPr>
+          <w:rFonts w:ascii="Calibri" w:cs="Calibri" w:eastAsia="Calibri" w:hAnsi="Calibri"/>
+          <w:color w:val="333333"/>
+          <w:sz w:val="24"/>
+          <w:szCs w:val="24"/>
+        </w:rPr>
+        <w:t xml:space="preserve"> Your opening hours, prices and service area should match on your website, Business Profile and social accounts, so no source contradicts another.</w:t>
+      </w:r>
+    </w:p>
+    <w:p>
+      <w:pPr>
+        <w:pStyle w:val="ListParagraph"/>
+        <w:numPr>
+          <w:ilvl w:val="0"/>
+          <w:numId w:val="1"/>
+        </w:numPr>
+      </w:pPr>
+      <w:r>
+        <w:rPr>
+          <w:rFonts w:ascii="Calibri" w:cs="Calibri" w:eastAsia="Calibri" w:hAnsi="Calibri"/>
+          <w:b/>
+          <w:bCs/>
+          <w:color w:val="333333"/>
+          <w:sz w:val="24"/>
+          <w:szCs w:val="24"/>
+        </w:rPr>
+        <w:t xml:space="preserve">Publish what only you know.</w:t>
+      </w:r>
+      <w:r>
+        <w:rPr>
+          <w:rFonts w:ascii="Calibri" w:cs="Calibri" w:eastAsia="Calibri" w:hAnsi="Calibri"/>
+          <w:color w:val="333333"/>
+          <w:sz w:val="24"/>
+          <w:szCs w:val="24"/>
+        </w:rPr>
+        <w:t xml:space="preserve"> Local prices, job photos, before-and-after results and your own tips give an AI answer a reason to cite you instead of a national chain.</w:t>
+      </w:r>
+    </w:p>
+    <w:p>
+      <w:pPr>
+        <w:spacing w:after="160"/>
+      </w:pPr>
+      <w:r>
+        <w:rPr>
+          <w:rFonts w:ascii="Calibri" w:cs="Calibri" w:eastAsia="Calibri" w:hAnsi="Calibri"/>
+          <w:color w:val="333333"/>
+          <w:sz w:val="24"/>
+          <w:szCs w:val="24"/>
+        </w:rPr>
+        <w:t xml:space="preserve">Google's own advice sums it up: there's no separate trick for AI search. Useful, accurate, specific pages are what get picked up.</w:t>
+      </w:r>
+    </w:p>
+    <w:p>
+      <w:pPr>
+        <w:pStyle w:val="Heading2"/>
+        <w:spacing w:after="120" w:before="300"/>
+      </w:pPr>
+      <w:r>
+        <w:rPr>
+          <w:rFonts w:ascii="Calibri" w:cs="Calibri" w:eastAsia="Calibri" w:hAnsi="Calibri"/>
+          <w:b/>
+          <w:bCs/>
+          <w:color w:val="7C3AED"/>
+          <w:sz w:val="36"/>
+          <w:szCs w:val="36"/>
+        </w:rPr>
+        <w:t xml:space="preserve">What are the risks of AI content for a small business?</w:t>
+      </w:r>
+    </w:p>
+    <w:p>
+      <w:pPr>
+        <w:spacing w:after="160"/>
+      </w:pPr>
+      <w:r>
+        <w:rPr>
+          <w:rFonts w:ascii="Calibri" w:cs="Calibri" w:eastAsia="Calibri" w:hAnsi="Calibri"/>
+          <w:color w:val="333333"/>
+          <w:sz w:val="24"/>
+          <w:szCs w:val="24"/>
+        </w:rPr>
+        <w:t xml:space="preserve">The main risks are wrong facts, content that sounds like everyone else, and publishing more than you can check. All three are managed by keeping a person in the loop, not by avoiding AI.</w:t>
+      </w:r>
+    </w:p>
+    <w:p>
+      <w:pPr>
+        <w:pStyle w:val="ListParagraph"/>
+        <w:numPr>
+          <w:ilvl w:val="0"/>
+          <w:numId w:val="1"/>
+        </w:numPr>
+      </w:pPr>
+      <w:r>
+        <w:rPr>
+          <w:rFonts w:ascii="Calibri" w:cs="Calibri" w:eastAsia="Calibri" w:hAnsi="Calibri"/>
+          <w:b/>
+          <w:bCs/>
+          <w:color w:val="333333"/>
+          <w:sz w:val="24"/>
+          <w:szCs w:val="24"/>
+        </w:rPr>
+        <w:t xml:space="preserve">Wrong facts.</w:t>
+      </w:r>
+      <w:r>
+        <w:rPr>
+          <w:rFonts w:ascii="Calibri" w:cs="Calibri" w:eastAsia="Calibri" w:hAnsi="Calibri"/>
+          <w:color w:val="333333"/>
+          <w:sz w:val="24"/>
+          <w:szCs w:val="24"/>
+        </w:rPr>
+        <w:t xml:space="preserve"> AI will confidently state an opening time or a statistic that isn't true. Instruct it to use only your files, and check every number before publishing.</w:t>
+      </w:r>
+    </w:p>
+    <w:p>
+      <w:pPr>
+        <w:pStyle w:val="ListParagraph"/>
+        <w:numPr>
+          <w:ilvl w:val="0"/>
+          <w:numId w:val="1"/>
+        </w:numPr>
+      </w:pPr>
+      <w:r>
+        <w:rPr>
+          <w:rFonts w:ascii="Calibri" w:cs="Calibri" w:eastAsia="Calibri" w:hAnsi="Calibri"/>
+          <w:b/>
+          <w:bCs/>
+          <w:color w:val="333333"/>
+          <w:sz w:val="24"/>
+          <w:szCs w:val="24"/>
+        </w:rPr>
         <w:t xml:space="preserve">Sameness.</w:t>
       </w:r>
       <w:r>
@@ -2222,7 +2390,7 @@
         </w:rPr>
         <w:t xml:space="preserve"> A generic draft reads like every competitor's generic draft. Add a photo, a price, a customer question or a real result to every piece. </w:t>
       </w:r>
-      <w:hyperlink w:history="1" r:id="rIdorsvlchuo19ghncqqu1yr">
+      <w:hyperlink w:history="1" r:id="rIdpnrkxi0qgfjwe8nvscmmn">
         <w:r>
           <w:rPr>
             <w:rStyle w:val="Hyperlink"/>
@@ -2273,7 +2441,7 @@
         </w:rPr>
         <w:t xml:space="preserve"> Google's spam policies target large volumes of low-value pages, whatever tool made them. Publish at the pace you can check. I cover what Google does and doesn't detect in </w:t>
       </w:r>
-      <w:hyperlink w:history="1" r:id="rIdcuxa4va4hpher0mtzz1gz">
+      <w:hyperlink w:history="1" r:id="rIdar-4fdxofavuc8-wj922j">
         <w:r>
           <w:rPr>
             <w:rStyle w:val="Hyperlink"/>
@@ -2318,21 +2486,43 @@
           <w:sz w:val="28"/>
           <w:szCs w:val="28"/>
         </w:rPr>
-        <w:t xml:space="preserve">What should a small business never let AI write on its own?</w:t>
-      </w:r>
-    </w:p>
-    <w:p>
-      <w:pPr>
-        <w:spacing w:after="160"/>
-      </w:pPr>
-      <w:r>
-        <w:rPr>
-          <w:rFonts w:ascii="Calibri" w:cs="Calibri" w:eastAsia="Calibri" w:hAnsi="Calibri"/>
-          <w:color w:val="333333"/>
-          <w:sz w:val="24"/>
-          <w:szCs w:val="24"/>
-        </w:rPr>
-        <w:t xml:space="preserve">Anything that makes a promise or a claim you could be held to: prices, guarantees, terms and conditions, health or safety advice, financial or legal guidance, and testimonials. AI can draft a structure, but a person with the facts must write or approve the final wording.</w:t>
+        <w:t xml:space="preserve">Is it safe to paste customer details into an AI tool?</w:t>
+      </w:r>
+    </w:p>
+    <w:p>
+      <w:pPr>
+        <w:spacing w:after="160"/>
+      </w:pPr>
+      <w:r>
+        <w:rPr>
+          <w:rFonts w:ascii="Calibri" w:cs="Calibri" w:eastAsia="Calibri" w:hAnsi="Calibri"/>
+          <w:color w:val="333333"/>
+          <w:sz w:val="24"/>
+          <w:szCs w:val="24"/>
+        </w:rPr>
+        <w:t xml:space="preserve">Only if your use of that tool meets UK GDPR, and the safest habit is not to paste names, emails, order details or health information at all. Check each provider's settings on whether your chats are used for training, and read the ICO's </w:t>
+      </w:r>
+      <w:hyperlink w:history="1" r:id="rIdl5ricikscrnehvon8xyqj">
+        <w:r>
+          <w:rPr>
+            <w:rStyle w:val="Hyperlink"/>
+            <w:rFonts w:ascii="Calibri" w:cs="Calibri" w:eastAsia="Calibri" w:hAnsi="Calibri"/>
+            <w:color w:val="0563C1"/>
+            <w:sz w:val="24"/>
+            <w:szCs w:val="24"/>
+            <w:u w:val="single"/>
+          </w:rPr>
+          <w:t xml:space="preserve">guidance on AI and data protection</w:t>
+        </w:r>
+      </w:hyperlink>
+      <w:r>
+        <w:rPr>
+          <w:rFonts w:ascii="Calibri" w:cs="Calibri" w:eastAsia="Calibri" w:hAnsi="Calibri"/>
+          <w:color w:val="333333"/>
+          <w:sz w:val="24"/>
+          <w:szCs w:val="24"/>
+        </w:rPr>
+        <w:t xml:space="preserve"> if AI touches customer data in your business.</w:t>
       </w:r>
     </w:p>
     <w:p>
@@ -2349,21 +2539,43 @@
           <w:sz w:val="28"/>
           <w:szCs w:val="28"/>
         </w:rPr>
-        <w:t xml:space="preserve">Can AI-drafted replies to Google reviews hurt my business?</w:t>
-      </w:r>
-    </w:p>
-    <w:p>
-      <w:pPr>
-        <w:spacing w:after="160"/>
-      </w:pPr>
-      <w:r>
-        <w:rPr>
-          <w:rFonts w:ascii="Calibri" w:cs="Calibri" w:eastAsia="Calibri" w:hAnsi="Calibri"/>
-          <w:color w:val="333333"/>
-          <w:sz w:val="24"/>
-          <w:szCs w:val="24"/>
-        </w:rPr>
-        <w:t xml:space="preserve">They can if they sound copied. Customers notice when every reply is the same polished paragraph. Use AI for a first draft, then add the customer's name, the specific issue they raised and what you're doing about it. For negative reviews, write the reply yourself.</w:t>
+        <w:t xml:space="preserve">Can I use AI-generated images in my marketing?</w:t>
+      </w:r>
+    </w:p>
+    <w:p>
+      <w:pPr>
+        <w:spacing w:after="160"/>
+      </w:pPr>
+      <w:r>
+        <w:rPr>
+          <w:rFonts w:ascii="Calibri" w:cs="Calibri" w:eastAsia="Calibri" w:hAnsi="Calibri"/>
+          <w:color w:val="333333"/>
+          <w:sz w:val="24"/>
+          <w:szCs w:val="24"/>
+        </w:rPr>
+        <w:t xml:space="preserve">Yes, and many small businesses do for social posts and blog headers. Avoid images that look like real customers, staff or other brands, and never use one to show a product or job result it doesn't match. If you sell online, Google's </w:t>
+      </w:r>
+      <w:hyperlink w:history="1" r:id="rIdduqgrqs1kedvnr_b3fl9-">
+        <w:r>
+          <w:rPr>
+            <w:rStyle w:val="Hyperlink"/>
+            <w:rFonts w:ascii="Calibri" w:cs="Calibri" w:eastAsia="Calibri" w:hAnsi="Calibri"/>
+            <w:color w:val="0563C1"/>
+            <w:sz w:val="24"/>
+            <w:szCs w:val="24"/>
+            <w:u w:val="single"/>
+          </w:rPr>
+          <w:t xml:space="preserve">AI content guidance</w:t>
+        </w:r>
+      </w:hyperlink>
+      <w:r>
+        <w:rPr>
+          <w:rFonts w:ascii="Calibri" w:cs="Calibri" w:eastAsia="Calibri" w:hAnsi="Calibri"/>
+          <w:color w:val="333333"/>
+          <w:sz w:val="24"/>
+          <w:szCs w:val="24"/>
+        </w:rPr>
+        <w:t xml:space="preserve"> asks e-commerce sites to label AI-generated product images with IPTC metadata.</w:t>
       </w:r>
     </w:p>
     <w:p>
@@ -2380,21 +2592,21 @@
           <w:sz w:val="28"/>
           <w:szCs w:val="28"/>
         </w:rPr>
-        <w:t xml:space="preserve">Should I use AI to write my website's service pages?</w:t>
-      </w:r>
-    </w:p>
-    <w:p>
-      <w:pPr>
-        <w:spacing w:after="160"/>
-      </w:pPr>
-      <w:r>
-        <w:rPr>
-          <w:rFonts w:ascii="Calibri" w:cs="Calibri" w:eastAsia="Calibri" w:hAnsi="Calibri"/>
-          <w:color w:val="333333"/>
-          <w:sz w:val="24"/>
-          <w:szCs w:val="24"/>
-        </w:rPr>
-        <w:t xml:space="preserve">Use it for structure and first drafts, not the final copy. Service pages carry your prices, process and proof, which are exactly the details AI doesn't know. Many owners get the best result by drafting with AI and then paying a copywriter for a final edit of their three or four most important pages.</w:t>
+        <w:t xml:space="preserve">How do I keep AI content consistent when several staff use it?</w:t>
+      </w:r>
+    </w:p>
+    <w:p>
+      <w:pPr>
+        <w:spacing w:after="160"/>
+      </w:pPr>
+      <w:r>
+        <w:rPr>
+          <w:rFonts w:ascii="Calibri" w:cs="Calibri" w:eastAsia="Calibri" w:hAnsi="Calibri"/>
+          <w:color w:val="333333"/>
+          <w:sz w:val="24"/>
+          <w:szCs w:val="24"/>
+        </w:rPr>
+        <w:t xml:space="preserve">Put the business brief, tone rules and banned words in one shared place so everyone drafts from the same source. On Claude's Team and Enterprise plans, projects can be shared with colleagues; on other tools, keep a shared document of instructions that everyone pastes in.</w:t>
       </w:r>
     </w:p>
     <w:p>
@@ -2411,52 +2623,21 @@
           <w:sz w:val="28"/>
           <w:szCs w:val="28"/>
         </w:rPr>
-        <w:t xml:space="preserve">How do I keep AI content consistent when several staff use it?</w:t>
-      </w:r>
-    </w:p>
-    <w:p>
-      <w:pPr>
-        <w:spacing w:after="160"/>
-      </w:pPr>
-      <w:r>
-        <w:rPr>
-          <w:rFonts w:ascii="Calibri" w:cs="Calibri" w:eastAsia="Calibri" w:hAnsi="Calibri"/>
-          <w:color w:val="333333"/>
-          <w:sz w:val="24"/>
-          <w:szCs w:val="24"/>
-        </w:rPr>
-        <w:t xml:space="preserve">Put the business brief, tone rules and banned words in one shared place so everyone drafts from the same source. On Claude's Team and Enterprise plans, projects can be shared with colleagues; on other tools, keep a shared document of instructions that everyone pastes in.</w:t>
-      </w:r>
-    </w:p>
-    <w:p>
-      <w:pPr>
-        <w:pStyle w:val="Heading3"/>
-        <w:spacing w:after="80" w:before="200"/>
-      </w:pPr>
-      <w:r>
-        <w:rPr>
-          <w:rFonts w:ascii="Calibri" w:cs="Calibri" w:eastAsia="Calibri" w:hAnsi="Calibri"/>
-          <w:b/>
-          <w:bCs/>
-          <w:color w:val="333333"/>
-          <w:sz w:val="28"/>
-          <w:szCs w:val="28"/>
-        </w:rPr>
-        <w:t xml:space="preserve">Does AI content work for local SEO?</w:t>
-      </w:r>
-    </w:p>
-    <w:p>
-      <w:pPr>
-        <w:spacing w:after="160"/>
-      </w:pPr>
-      <w:r>
-        <w:rPr>
-          <w:rFonts w:ascii="Calibri" w:cs="Calibri" w:eastAsia="Calibri" w:hAnsi="Calibri"/>
-          <w:color w:val="333333"/>
-          <w:sz w:val="24"/>
-          <w:szCs w:val="24"/>
-        </w:rPr>
-        <w:t xml:space="preserve">It can help, because local SEO rewards frequent, useful updates: Business Profile posts, answers to local questions and service-area pages. What makes it work is local detail AI can't invent, such as street names, local events, real job photos and your own customer questions.</w:t>
+        <w:t xml:space="preserve">Can AI write content in Welsh, Urdu or other languages my customers speak?</w:t>
+      </w:r>
+    </w:p>
+    <w:p>
+      <w:pPr>
+        <w:spacing w:after="160"/>
+      </w:pPr>
+      <w:r>
+        <w:rPr>
+          <w:rFonts w:ascii="Calibri" w:cs="Calibri" w:eastAsia="Calibri" w:hAnsi="Calibri"/>
+          <w:color w:val="333333"/>
+          <w:sz w:val="24"/>
+          <w:szCs w:val="24"/>
+        </w:rPr>
+        <w:t xml:space="preserve">Yes, Claude and ChatGPT both write in many languages, which helps businesses serving more than one community. Have a fluent speaker check anything customer-facing before it goes out, because small errors in tone or formality are easy to miss if you don't speak the language.</w:t>
       </w:r>
     </w:p>
     <w:p>
@@ -2503,7 +2684,7 @@
         </w:rPr>
         <w:t xml:space="preserve">If you'd rather have content planned and written for you, our </w:t>
       </w:r>
-      <w:hyperlink w:history="1" r:id="rIdcmvwtniz8ebr1oxdl5iyq">
+      <w:hyperlink w:history="1" r:id="rIdpg5ojod25no0kc0zemuhx">
         <w:r>
           <w:rPr>
             <w:rStyle w:val="Hyperlink"/>

</xml_diff>

<commit_message>
Align small business images 02 and 04 with audited article
Co-Authored-By: Claude Opus 5.5 <noreply@anthropic.com>
Claude-Session: https://claude.ai/code/session_01GQXcnZLn4f9MkUS7SEqp5J
</commit_message>
<xml_diff>
--- a/blog-content/AI-Content-Writing-for-Small-Business.docx
+++ b/blog-content/AI-Content-Writing-for-Small-Business.docx
@@ -962,7 +962,7 @@
         </w:rPr>
         <w:t xml:space="preserve"> the Office for National Statistics found </w:t>
       </w:r>
-      <w:hyperlink w:history="1" r:id="rId0sof0krflo0yexrk5v8w_">
+      <w:hyperlink w:history="1" r:id="rIdit3wvfxbjsedk8suoongd">
         <w:r>
           <w:rPr>
             <w:rStyle w:val="Hyperlink"/>
@@ -1013,7 +1013,7 @@
         </w:rPr>
         <w:t xml:space="preserve"> the British Chambers of Commerce reported in March 2026 that </w:t>
       </w:r>
-      <w:hyperlink w:history="1" r:id="rIdhkawtrqnzyk8bck-uqbvd">
+      <w:hyperlink w:history="1" r:id="rIdainebab30k0wkgeacodsm">
         <w:r>
           <w:rPr>
             <w:rStyle w:val="Hyperlink"/>
@@ -1064,7 +1064,7 @@
         </w:rPr>
         <w:t xml:space="preserve"> the U.S. Chamber of Commerce found </w:t>
       </w:r>
-      <w:hyperlink w:history="1" r:id="rIdkvibrivgnom-wxhlm7sf8">
+      <w:hyperlink w:history="1" r:id="rIdpfvysio1nl2_zqbl4peiu">
         <w:r>
           <w:rPr>
             <w:rStyle w:val="Hyperlink"/>
@@ -1114,7 +1114,7 @@
         </w:rPr>
         <w:t xml:space="preserve">There's also a warning in the marketing data. HubSpot's </w:t>
       </w:r>
-      <w:hyperlink w:history="1" r:id="rId_oi6begv1jjbozxyqliyc">
+      <w:hyperlink w:history="1" r:id="rIdnaw3san5wnzeohlzg1mwh">
         <w:r>
           <w:rPr>
             <w:rStyle w:val="Hyperlink"/>
@@ -1206,7 +1206,7 @@
         </w:rPr>
         <w:t xml:space="preserve">The fairest comparison is with hiring a writer. The 2026 ProCopywriters survey of 383 UK freelance copywriters puts the </w:t>
       </w:r>
-      <w:hyperlink w:history="1" r:id="rId-ah3flyki5_j1l2zzb6x8">
+      <w:hyperlink w:history="1" r:id="rId8hvozl_-xlf8rpr3qzwdm">
         <w:r>
           <w:rPr>
             <w:rStyle w:val="Hyperlink"/>
@@ -1389,7 +1389,7 @@
         </w:rPr>
         <w:t xml:space="preserve"> my first choice for writing. It follows long, detailed instructions consistently, which matters when you want every draft to sound like your business. I compare it with the alternatives in </w:t>
       </w:r>
-      <w:hyperlink w:history="1" r:id="rIduwi4wi4q55h-ti7tbiyr4">
+      <w:hyperlink w:history="1" r:id="rIdw5uyu7d63km17wnafztvo">
         <w:r>
           <w:rPr>
             <w:rStyle w:val="Hyperlink"/>
@@ -1469,7 +1469,7 @@
         </w:rPr>
         <w:t xml:space="preserve"> its built-in assistant, </w:t>
       </w:r>
-      <w:hyperlink w:history="1" r:id="rIdg9i2sokvtsdo2_ici0ymn">
+      <w:hyperlink w:history="1" r:id="rIdn1lnrwei0w2y4ng1eyxee">
         <w:r>
           <w:rPr>
             <w:rStyle w:val="Hyperlink"/>
@@ -1520,7 +1520,7 @@
         </w:rPr>
         <w:t xml:space="preserve"> the </w:t>
       </w:r>
-      <w:hyperlink w:history="1" r:id="rIdep_fz_f6ya2t0qojoclj2">
+      <w:hyperlink w:history="1" r:id="rIda053ut73mhm0czr9enemx">
         <w:r>
           <w:rPr>
             <w:rStyle w:val="Hyperlink"/>
@@ -1746,7 +1746,7 @@
         </w:rPr>
         <w:t xml:space="preserve">This is the single change that improved my drafts most. According to Anthropic's help centre, </w:t>
       </w:r>
-      <w:hyperlink w:history="1" r:id="rIdw8mhfn0pxcg6mpspukavu">
+      <w:hyperlink w:history="1" r:id="rIdtnpa3bg-fqdwy3zwxpipl">
         <w:r>
           <w:rPr>
             <w:rStyle w:val="Hyperlink"/>
@@ -1874,7 +1874,7 @@
         </w:rPr>
         <w:t xml:space="preserve">On paid plans you can go a step further with </w:t>
       </w:r>
-      <w:hyperlink w:history="1" r:id="rIdmuvctcx4i1wdujj1lk9cp">
+      <w:hyperlink w:history="1" r:id="rIdlip_v4kukaj9czbwtrtvf">
         <w:r>
           <w:rPr>
             <w:rStyle w:val="Hyperlink"/>
@@ -2059,7 +2059,7 @@
         </w:rPr>
         <w:t xml:space="preserve">Aim for one blog post a week answering one of those questions, two Google Business Profile posts a week and one email every fortnight. Turn each blog post into three social captions. Before publishing any blog post, write a clear title and check it's under 60 characters; my guide to </w:t>
       </w:r>
-      <w:hyperlink w:history="1" r:id="rIdes9m2lvdcczoxb0ikkx59">
+      <w:hyperlink w:history="1" r:id="rIduxxvgh3uonkwsdmvchxwn">
         <w:r>
           <w:rPr>
             <w:rStyle w:val="Hyperlink"/>
@@ -2081,7 +2081,7 @@
         </w:rPr>
         <w:t xml:space="preserve"> covers how. For the drafting process itself, follow the </w:t>
       </w:r>
-      <w:hyperlink w:history="1" r:id="rIdau0dcfkfe_cnz_5qvp9qs">
+      <w:hyperlink w:history="1" r:id="rIdu8h4gpiirlzrkxzcc_rxp">
         <w:r>
           <w:rPr>
             <w:rStyle w:val="Hyperlink"/>
@@ -2164,7 +2164,7 @@
         </w:rPr>
         <w:t xml:space="preserve">Get your basics right in normal Google Search first. Google says its AI Overviews and AI Mode have </w:t>
       </w:r>
-      <w:hyperlink w:history="1" r:id="rIdhm73fof_mxsn2nndj6cyv">
+      <w:hyperlink w:history="1" r:id="rIdr7fu05gqwvl-johkn6exv">
         <w:r>
           <w:rPr>
             <w:rStyle w:val="Hyperlink"/>
@@ -2390,7 +2390,7 @@
         </w:rPr>
         <w:t xml:space="preserve"> A generic draft reads like every competitor's generic draft. Add a photo, a price, a customer question or a real result to every piece. </w:t>
       </w:r>
-      <w:hyperlink w:history="1" r:id="rIdpnrkxi0qgfjwe8nvscmmn">
+      <w:hyperlink w:history="1" r:id="rIdcgu86t5p3dsw9c50oliir">
         <w:r>
           <w:rPr>
             <w:rStyle w:val="Hyperlink"/>
@@ -2441,7 +2441,7 @@
         </w:rPr>
         <w:t xml:space="preserve"> Google's spam policies target large volumes of low-value pages, whatever tool made them. Publish at the pace you can check. I cover what Google does and doesn't detect in </w:t>
       </w:r>
-      <w:hyperlink w:history="1" r:id="rIdar-4fdxofavuc8-wj922j">
+      <w:hyperlink w:history="1" r:id="rId58om6e9gn7zgkdrbmmrut">
         <w:r>
           <w:rPr>
             <w:rStyle w:val="Hyperlink"/>
@@ -2502,7 +2502,7 @@
         </w:rPr>
         <w:t xml:space="preserve">Only if your use of that tool meets UK GDPR, and the safest habit is not to paste names, emails, order details or health information at all. Check each provider's settings on whether your chats are used for training, and read the ICO's </w:t>
       </w:r>
-      <w:hyperlink w:history="1" r:id="rIdl5ricikscrnehvon8xyqj">
+      <w:hyperlink w:history="1" r:id="rIdjwu4xcglbmeqndun9f0cr">
         <w:r>
           <w:rPr>
             <w:rStyle w:val="Hyperlink"/>
@@ -2555,7 +2555,7 @@
         </w:rPr>
         <w:t xml:space="preserve">Yes, and many small businesses do for social posts and blog headers. Avoid images that look like real customers, staff or other brands, and never use one to show a product or job result it doesn't match. If you sell online, Google's </w:t>
       </w:r>
-      <w:hyperlink w:history="1" r:id="rIdduqgrqs1kedvnr_b3fl9-">
+      <w:hyperlink w:history="1" r:id="rId_h-nu-mlany2wwvjkaqu-">
         <w:r>
           <w:rPr>
             <w:rStyle w:val="Hyperlink"/>
@@ -2684,7 +2684,7 @@
         </w:rPr>
         <w:t xml:space="preserve">If you'd rather have content planned and written for you, our </w:t>
       </w:r>
-      <w:hyperlink w:history="1" r:id="rIdpg5ojod25no0kc0zemuhx">
+      <w:hyperlink w:history="1" r:id="rIds7te5iqmmxcy8aw5vcsf9">
         <w:r>
           <w:rPr>
             <w:rStyle w:val="Hyperlink"/>

</xml_diff>

<commit_message>
Update cluster 1 plan from roadmap sheet; add pillar and service links, fix tool URLs and anchors in 5 drafts
Co-Authored-By: Claude Opus 5.5 <noreply@anthropic.com>
Claude-Session: https://claude.ai/code/session_01GQXcnZLn4f9MkUS7SEqp5J
</commit_message>
<xml_diff>
--- a/blog-content/AI-Content-Writing-for-Small-Business.docx
+++ b/blog-content/AI-Content-Writing-for-Small-Business.docx
@@ -962,7 +962,7 @@
         </w:rPr>
         <w:t xml:space="preserve"> the Office for National Statistics found </w:t>
       </w:r>
-      <w:hyperlink w:history="1" r:id="rIdit3wvfxbjsedk8suoongd">
+      <w:hyperlink w:history="1" r:id="rIddacfsj8rtrqi81uiww0k7">
         <w:r>
           <w:rPr>
             <w:rStyle w:val="Hyperlink"/>
@@ -1013,7 +1013,7 @@
         </w:rPr>
         <w:t xml:space="preserve"> the British Chambers of Commerce reported in March 2026 that </w:t>
       </w:r>
-      <w:hyperlink w:history="1" r:id="rIdainebab30k0wkgeacodsm">
+      <w:hyperlink w:history="1" r:id="rIdqr9eiv1vbll-a9arqr-es">
         <w:r>
           <w:rPr>
             <w:rStyle w:val="Hyperlink"/>
@@ -1064,7 +1064,7 @@
         </w:rPr>
         <w:t xml:space="preserve"> the U.S. Chamber of Commerce found </w:t>
       </w:r>
-      <w:hyperlink w:history="1" r:id="rIdpfvysio1nl2_zqbl4peiu">
+      <w:hyperlink w:history="1" r:id="rIdju-n5eovd2kdruv3pvjlv">
         <w:r>
           <w:rPr>
             <w:rStyle w:val="Hyperlink"/>
@@ -1114,7 +1114,7 @@
         </w:rPr>
         <w:t xml:space="preserve">There's also a warning in the marketing data. HubSpot's </w:t>
       </w:r>
-      <w:hyperlink w:history="1" r:id="rIdnaw3san5wnzeohlzg1mwh">
+      <w:hyperlink w:history="1" r:id="rIda0ajedgr0jjpztnfgvv_h">
         <w:r>
           <w:rPr>
             <w:rStyle w:val="Hyperlink"/>
@@ -1206,7 +1206,7 @@
         </w:rPr>
         <w:t xml:space="preserve">The fairest comparison is with hiring a writer. The 2026 ProCopywriters survey of 383 UK freelance copywriters puts the </w:t>
       </w:r>
-      <w:hyperlink w:history="1" r:id="rId8hvozl_-xlf8rpr3qzwdm">
+      <w:hyperlink w:history="1" r:id="rIddsefb751ro-wlno6rsufi">
         <w:r>
           <w:rPr>
             <w:rStyle w:val="Hyperlink"/>
@@ -1389,7 +1389,7 @@
         </w:rPr>
         <w:t xml:space="preserve"> my first choice for writing. It follows long, detailed instructions consistently, which matters when you want every draft to sound like your business. I compare it with the alternatives in </w:t>
       </w:r>
-      <w:hyperlink w:history="1" r:id="rIdw5uyu7d63km17wnafztvo">
+      <w:hyperlink w:history="1" r:id="rIdv6p8gge-merbopucgysb8">
         <w:r>
           <w:rPr>
             <w:rStyle w:val="Hyperlink"/>
@@ -1469,7 +1469,7 @@
         </w:rPr>
         <w:t xml:space="preserve"> its built-in assistant, </w:t>
       </w:r>
-      <w:hyperlink w:history="1" r:id="rIdn1lnrwei0w2y4ng1eyxee">
+      <w:hyperlink w:history="1" r:id="rIdko5mejidkjo6uadgnemco">
         <w:r>
           <w:rPr>
             <w:rStyle w:val="Hyperlink"/>
@@ -1520,7 +1520,7 @@
         </w:rPr>
         <w:t xml:space="preserve"> the </w:t>
       </w:r>
-      <w:hyperlink w:history="1" r:id="rIda053ut73mhm0czr9enemx">
+      <w:hyperlink w:history="1" r:id="rIdqch3ay4an4nhtjxgq2moz">
         <w:r>
           <w:rPr>
             <w:rStyle w:val="Hyperlink"/>
@@ -1746,7 +1746,7 @@
         </w:rPr>
         <w:t xml:space="preserve">This is the single change that improved my drafts most. According to Anthropic's help centre, </w:t>
       </w:r>
-      <w:hyperlink w:history="1" r:id="rIdtnpa3bg-fqdwy3zwxpipl">
+      <w:hyperlink w:history="1" r:id="rIddr7oe2qphp3kzizfzpmf_">
         <w:r>
           <w:rPr>
             <w:rStyle w:val="Hyperlink"/>
@@ -1874,7 +1874,7 @@
         </w:rPr>
         <w:t xml:space="preserve">On paid plans you can go a step further with </w:t>
       </w:r>
-      <w:hyperlink w:history="1" r:id="rIdlip_v4kukaj9czbwtrtvf">
+      <w:hyperlink w:history="1" r:id="rIdgvkwmcrnpwq85tvmsnv19">
         <w:r>
           <w:rPr>
             <w:rStyle w:val="Hyperlink"/>
@@ -2059,7 +2059,7 @@
         </w:rPr>
         <w:t xml:space="preserve">Aim for one blog post a week answering one of those questions, two Google Business Profile posts a week and one email every fortnight. Turn each blog post into three social captions. Before publishing any blog post, write a clear title and check it's under 60 characters; my guide to </w:t>
       </w:r>
-      <w:hyperlink w:history="1" r:id="rIduxxvgh3uonkwsdmvchxwn">
+      <w:hyperlink w:history="1" r:id="rIdhf2oms0adrv1ww5jyinfq">
         <w:r>
           <w:rPr>
             <w:rStyle w:val="Hyperlink"/>
@@ -2081,7 +2081,7 @@
         </w:rPr>
         <w:t xml:space="preserve"> covers how. For the drafting process itself, follow the </w:t>
       </w:r>
-      <w:hyperlink w:history="1" r:id="rIdu8h4gpiirlzrkxzcc_rxp">
+      <w:hyperlink w:history="1" r:id="rIdigcg_jipwdu0hdpqxdpoc">
         <w:r>
           <w:rPr>
             <w:rStyle w:val="Hyperlink"/>
@@ -2164,7 +2164,7 @@
         </w:rPr>
         <w:t xml:space="preserve">Get your basics right in normal Google Search first. Google says its AI Overviews and AI Mode have </w:t>
       </w:r>
-      <w:hyperlink w:history="1" r:id="rIdr7fu05gqwvl-johkn6exv">
+      <w:hyperlink w:history="1" r:id="rId9uai2m6vhdeisguf0vcfh">
         <w:r>
           <w:rPr>
             <w:rStyle w:val="Hyperlink"/>
@@ -2390,7 +2390,7 @@
         </w:rPr>
         <w:t xml:space="preserve"> A generic draft reads like every competitor's generic draft. Add a photo, a price, a customer question or a real result to every piece. </w:t>
       </w:r>
-      <w:hyperlink w:history="1" r:id="rIdcgu86t5p3dsw9c50oliir">
+      <w:hyperlink w:history="1" r:id="rIdg_bxxuszwvs0e_p_d08gq">
         <w:r>
           <w:rPr>
             <w:rStyle w:val="Hyperlink"/>
@@ -2441,7 +2441,7 @@
         </w:rPr>
         <w:t xml:space="preserve"> Google's spam policies target large volumes of low-value pages, whatever tool made them. Publish at the pace you can check. I cover what Google does and doesn't detect in </w:t>
       </w:r>
-      <w:hyperlink w:history="1" r:id="rId58om6e9gn7zgkdrbmmrut">
+      <w:hyperlink w:history="1" r:id="rIdyynvynowpglppupjsvrki">
         <w:r>
           <w:rPr>
             <w:rStyle w:val="Hyperlink"/>
@@ -2502,7 +2502,7 @@
         </w:rPr>
         <w:t xml:space="preserve">Only if your use of that tool meets UK GDPR, and the safest habit is not to paste names, emails, order details or health information at all. Check each provider's settings on whether your chats are used for training, and read the ICO's </w:t>
       </w:r>
-      <w:hyperlink w:history="1" r:id="rIdjwu4xcglbmeqndun9f0cr">
+      <w:hyperlink w:history="1" r:id="rIdic3kxh40ir-p2hx2itd7g">
         <w:r>
           <w:rPr>
             <w:rStyle w:val="Hyperlink"/>
@@ -2555,7 +2555,7 @@
         </w:rPr>
         <w:t xml:space="preserve">Yes, and many small businesses do for social posts and blog headers. Avoid images that look like real customers, staff or other brands, and never use one to show a product or job result it doesn't match. If you sell online, Google's </w:t>
       </w:r>
-      <w:hyperlink w:history="1" r:id="rId_h-nu-mlany2wwvjkaqu-">
+      <w:hyperlink w:history="1" r:id="rId0ti0za6mpdj6gqs_jlb1u">
         <w:r>
           <w:rPr>
             <w:rStyle w:val="Hyperlink"/>
@@ -2684,7 +2684,7 @@
         </w:rPr>
         <w:t xml:space="preserve">If you'd rather have content planned and written for you, our </w:t>
       </w:r>
-      <w:hyperlink w:history="1" r:id="rIds7te5iqmmxcy8aw5vcsf9">
+      <w:hyperlink w:history="1" r:id="rIdhn3np4z9ekowvgz85uxcq">
         <w:r>
           <w:rPr>
             <w:rStyle w:val="Hyperlink"/>
@@ -2705,6 +2705,42 @@
           <w:szCs w:val="24"/>
         </w:rPr>
         <w:t xml:space="preserve"> uses this same process.</w:t>
+      </w:r>
+    </w:p>
+    <w:p>
+      <w:pPr>
+        <w:spacing w:after="160"/>
+      </w:pPr>
+      <w:r>
+        <w:rPr>
+          <w:rFonts w:ascii="Calibri" w:cs="Calibri" w:eastAsia="Calibri" w:hAnsi="Calibri"/>
+          <w:color w:val="333333"/>
+          <w:sz w:val="24"/>
+          <w:szCs w:val="24"/>
+        </w:rPr>
+        <w:t xml:space="preserve">For the bigger picture on tools, SEO and Google's rules, start with our </w:t>
+      </w:r>
+      <w:hyperlink w:history="1" r:id="rIdmpngcplhauex-ibmdpf-8">
+        <w:r>
+          <w:rPr>
+            <w:rStyle w:val="Hyperlink"/>
+            <w:rFonts w:ascii="Calibri" w:cs="Calibri" w:eastAsia="Calibri" w:hAnsi="Calibri"/>
+            <w:color w:val="0563C1"/>
+            <w:sz w:val="24"/>
+            <w:szCs w:val="24"/>
+            <w:u w:val="single"/>
+          </w:rPr>
+          <w:t xml:space="preserve">complete guide to AI content writing</w:t>
+        </w:r>
+      </w:hyperlink>
+      <w:r>
+        <w:rPr>
+          <w:rFonts w:ascii="Calibri" w:cs="Calibri" w:eastAsia="Calibri" w:hAnsi="Calibri"/>
+          <w:color w:val="333333"/>
+          <w:sz w:val="24"/>
+          <w:szCs w:val="24"/>
+        </w:rPr>
+        <w:t xml:space="preserve">.</w:t>
       </w:r>
     </w:p>
     <w:sectPr>

</xml_diff>